<commit_message>
acta de constitucion soc
</commit_message>
<xml_diff>
--- a/Fase uno/Grupal/1.4_APT122_FormativaFase1.docx.docx
+++ b/Fase uno/Grupal/1.4_APT122_FormativaFase1.docx.docx
@@ -617,30 +617,14 @@
                 <w:b/>
                 <w:bCs/>
               </w:rPr>
-              <w:t xml:space="preserve">17.148.061-2 </w:t>
-            </w:r>
-            <w:proofErr w:type="gramStart"/>
-            <w:r>
-              <w:rPr>
-                <w:b/>
-                <w:bCs/>
-              </w:rPr>
-              <w:t xml:space="preserve">/  </w:t>
-            </w:r>
-            <w:r>
-              <w:rPr>
-                <w:b/>
-                <w:bCs/>
-              </w:rPr>
-              <w:t>19.220.142</w:t>
-            </w:r>
-            <w:proofErr w:type="gramEnd"/>
-            <w:r>
-              <w:rPr>
-                <w:b/>
-                <w:bCs/>
-              </w:rPr>
-              <w:t>-k</w:t>
+              <w:t xml:space="preserve">17.148.061-2 /  </w:t>
+            </w:r>
+            <w:r>
+              <w:rPr>
+                <w:b/>
+                <w:bCs/>
+              </w:rPr>
+              <w:t>19.220.142-k</w:t>
             </w:r>
           </w:p>
         </w:tc>
@@ -3059,23 +3043,7 @@
                 <w:lang w:eastAsia="es-CL"/>
               </w:rPr>
               <w:br/>
-              <w:t xml:space="preserve">El uso de </w:t>
-            </w:r>
-            <w:proofErr w:type="spellStart"/>
-            <w:r>
-              <w:rPr>
-                <w:rFonts w:ascii="Calibri" w:hAnsi="Calibri" w:cs="Arial"/>
-                <w:lang w:eastAsia="es-CL"/>
-              </w:rPr>
-              <w:t>frameworks</w:t>
-            </w:r>
-            <w:proofErr w:type="spellEnd"/>
-            <w:r>
-              <w:rPr>
-                <w:rFonts w:ascii="Calibri" w:hAnsi="Calibri" w:cs="Arial"/>
-                <w:lang w:eastAsia="es-CL"/>
-              </w:rPr>
-              <w:t xml:space="preserve"> modernos, entornos cloud y software de gestión ágil permite desarrollar un SaaS escalable y seguro sin dependencia de hardware especializado.</w:t>
+              <w:t>El uso de frameworks modernos, entornos cloud y software de gestión ágil permite desarrollar un SaaS escalable y seguro sin dependencia de hardware especializado.</w:t>
             </w:r>
           </w:p>
           <w:p>
@@ -3938,23 +3906,7 @@
                 <w:rFonts w:cstheme="minorHAnsi"/>
                 <w:lang w:eastAsia="es-CL"/>
               </w:rPr>
-              <w:t xml:space="preserve"> Se desarrollará una interfaz intuitiva y un </w:t>
-            </w:r>
-            <w:proofErr w:type="spellStart"/>
-            <w:r>
-              <w:rPr>
-                <w:rFonts w:cstheme="minorHAnsi"/>
-                <w:lang w:eastAsia="es-CL"/>
-              </w:rPr>
-              <w:t>backend</w:t>
-            </w:r>
-            <w:proofErr w:type="spellEnd"/>
-            <w:r>
-              <w:rPr>
-                <w:rFonts w:cstheme="minorHAnsi"/>
-                <w:lang w:eastAsia="es-CL"/>
-              </w:rPr>
-              <w:t xml:space="preserve"> robusto con validaciones de datos para garantizar confiabilidad.</w:t>
+              <w:t xml:space="preserve"> Se desarrollará una interfaz intuitiva y un backend robusto con validaciones de datos para garantizar confiabilidad.</w:t>
             </w:r>
           </w:p>
           <w:p>
@@ -4097,23 +4049,7 @@
                 <w:rFonts w:cstheme="minorHAnsi"/>
                 <w:lang w:eastAsia="es-CL"/>
               </w:rPr>
-              <w:t xml:space="preserve"> El sistema enviará alertas automáticas a residentes sobre disponibilidad de espacios comunes e infracciones de uso (</w:t>
-            </w:r>
-            <w:proofErr w:type="spellStart"/>
-            <w:r>
-              <w:rPr>
-                <w:rFonts w:cstheme="minorHAnsi"/>
-                <w:lang w:eastAsia="es-CL"/>
-              </w:rPr>
-              <w:t>ej</w:t>
-            </w:r>
-            <w:proofErr w:type="spellEnd"/>
-            <w:r>
-              <w:rPr>
-                <w:rFonts w:cstheme="minorHAnsi"/>
-                <w:lang w:eastAsia="es-CL"/>
-              </w:rPr>
-              <w:t>: ruido, horarios excedidos).</w:t>
+              <w:t xml:space="preserve"> El sistema enviará alertas automáticas a residentes sobre disponibilidad de espacios comunes e infracciones de uso (ej: ruido, horarios excedidos).</w:t>
             </w:r>
           </w:p>
           <w:p>
@@ -4174,39 +4110,7 @@
                 <w:rFonts w:cstheme="minorHAnsi"/>
                 <w:lang w:eastAsia="es-CL"/>
               </w:rPr>
-              <w:t xml:space="preserve"> Se integrará un sistema de notificaciones </w:t>
-            </w:r>
-            <w:proofErr w:type="spellStart"/>
-            <w:r>
-              <w:rPr>
-                <w:rFonts w:cstheme="minorHAnsi"/>
-                <w:lang w:eastAsia="es-CL"/>
-              </w:rPr>
-              <w:t>push</w:t>
-            </w:r>
-            <w:proofErr w:type="spellEnd"/>
-            <w:r>
-              <w:rPr>
-                <w:rFonts w:cstheme="minorHAnsi"/>
-                <w:lang w:eastAsia="es-CL"/>
-              </w:rPr>
-              <w:t xml:space="preserve"> y correos electrónicos en tiempo real usando </w:t>
-            </w:r>
-            <w:proofErr w:type="spellStart"/>
-            <w:r>
-              <w:rPr>
-                <w:rFonts w:cstheme="minorHAnsi"/>
-                <w:lang w:eastAsia="es-CL"/>
-              </w:rPr>
-              <w:t>APIs</w:t>
-            </w:r>
-            <w:proofErr w:type="spellEnd"/>
-            <w:r>
-              <w:rPr>
-                <w:rFonts w:cstheme="minorHAnsi"/>
-                <w:lang w:eastAsia="es-CL"/>
-              </w:rPr>
-              <w:t xml:space="preserve"> confiables y lógicas de detección automatizadas.</w:t>
+              <w:t xml:space="preserve"> Se integrará un sistema de notificaciones push y correos electrónicos en tiempo real usando APIs confiables y lógicas de detección automatizadas.</w:t>
             </w:r>
           </w:p>
           <w:p>
@@ -4714,23 +4618,7 @@
                 <w:rFonts w:cstheme="minorHAnsi"/>
                 <w:lang w:eastAsia="es-CL"/>
               </w:rPr>
-              <w:t xml:space="preserve"> El sistema debe permitir el procesamiento de pagos de GGCC a través de </w:t>
-            </w:r>
-            <w:proofErr w:type="spellStart"/>
-            <w:r>
-              <w:rPr>
-                <w:rFonts w:cstheme="minorHAnsi"/>
-                <w:lang w:eastAsia="es-CL"/>
-              </w:rPr>
-              <w:t>WebPay</w:t>
-            </w:r>
-            <w:proofErr w:type="spellEnd"/>
-            <w:r>
-              <w:rPr>
-                <w:rFonts w:cstheme="minorHAnsi"/>
-                <w:lang w:eastAsia="es-CL"/>
-              </w:rPr>
-              <w:t xml:space="preserve">, enviando un comprobante de pago por correo electrónico inmediatamente después de realizado el pago. </w:t>
+              <w:t xml:space="preserve"> El sistema debe permitir el procesamiento de pagos de GGCC a través de WebPay, enviando un comprobante de pago por correo electrónico inmediatamente después de realizado el pago. </w:t>
             </w:r>
           </w:p>
           <w:p>
@@ -4791,23 +4679,7 @@
                 <w:rFonts w:cstheme="minorHAnsi"/>
                 <w:lang w:eastAsia="es-CL"/>
               </w:rPr>
-              <w:t xml:space="preserve"> Mediante una integración con la API de </w:t>
-            </w:r>
-            <w:proofErr w:type="spellStart"/>
-            <w:r>
-              <w:rPr>
-                <w:rFonts w:cstheme="minorHAnsi"/>
-                <w:lang w:eastAsia="es-CL"/>
-              </w:rPr>
-              <w:t>WebPay</w:t>
-            </w:r>
-            <w:proofErr w:type="spellEnd"/>
-            <w:r>
-              <w:rPr>
-                <w:rFonts w:cstheme="minorHAnsi"/>
-                <w:lang w:eastAsia="es-CL"/>
-              </w:rPr>
-              <w:t xml:space="preserve"> y un sistema automatizado de correos electrónicos. </w:t>
+              <w:t xml:space="preserve"> Mediante una integración con la API de WebPay y un sistema automatizado de correos electrónicos. </w:t>
             </w:r>
           </w:p>
           <w:p>
@@ -5472,25 +5344,14 @@
                 <w:lang w:eastAsia="es-CL"/>
               </w:rPr>
             </w:pPr>
-            <w:proofErr w:type="spellStart"/>
-            <w:r>
-              <w:rPr>
-                <w:rFonts w:cstheme="minorHAnsi"/>
-                <w:b/>
-                <w:bCs/>
-                <w:lang w:eastAsia="es-CL"/>
-              </w:rPr>
-              <w:t>Dashboard</w:t>
-            </w:r>
-            <w:proofErr w:type="spellEnd"/>
-            <w:r>
-              <w:rPr>
-                <w:rFonts w:cstheme="minorHAnsi"/>
-                <w:b/>
-                <w:bCs/>
-                <w:lang w:eastAsia="es-CL"/>
-              </w:rPr>
-              <w:t xml:space="preserve"> informativo </w:t>
+            <w:r>
+              <w:rPr>
+                <w:rFonts w:cstheme="minorHAnsi"/>
+                <w:b/>
+                <w:bCs/>
+                <w:lang w:eastAsia="es-CL"/>
+              </w:rPr>
+              <w:t xml:space="preserve">Dashboard informativo </w:t>
             </w:r>
           </w:p>
           <w:p>
@@ -5520,23 +5381,7 @@
                 <w:rFonts w:cstheme="minorHAnsi"/>
                 <w:lang w:eastAsia="es-CL"/>
               </w:rPr>
-              <w:t xml:space="preserve"> Crear un </w:t>
-            </w:r>
-            <w:proofErr w:type="spellStart"/>
-            <w:r>
-              <w:rPr>
-                <w:rFonts w:cstheme="minorHAnsi"/>
-                <w:lang w:eastAsia="es-CL"/>
-              </w:rPr>
-              <w:t>dashboard</w:t>
-            </w:r>
-            <w:proofErr w:type="spellEnd"/>
-            <w:r>
-              <w:rPr>
-                <w:rFonts w:cstheme="minorHAnsi"/>
-                <w:lang w:eastAsia="es-CL"/>
-              </w:rPr>
-              <w:t xml:space="preserve"> informativo que permita a los administradores y residentes visualizar en tiempo real datos financieros clave. </w:t>
+              <w:t xml:space="preserve"> Crear un dashboard informativo que permita a los administradores y residentes visualizar en tiempo real datos financieros clave. </w:t>
             </w:r>
           </w:p>
           <w:p>
@@ -5656,23 +5501,7 @@
                 <w:rFonts w:cstheme="minorHAnsi"/>
                 <w:lang w:eastAsia="es-CL"/>
               </w:rPr>
-              <w:t xml:space="preserve"> El </w:t>
-            </w:r>
-            <w:proofErr w:type="spellStart"/>
-            <w:r>
-              <w:rPr>
-                <w:rFonts w:cstheme="minorHAnsi"/>
-                <w:lang w:eastAsia="es-CL"/>
-              </w:rPr>
-              <w:t>dashboard</w:t>
-            </w:r>
-            <w:proofErr w:type="spellEnd"/>
-            <w:r>
-              <w:rPr>
-                <w:rFonts w:cstheme="minorHAnsi"/>
-                <w:lang w:eastAsia="es-CL"/>
-              </w:rPr>
-              <w:t xml:space="preserve"> debe estar implementado y en funcionamiento en un plazo de 6 meses desde el inicio del proyecto. </w:t>
+              <w:t xml:space="preserve"> El dashboard debe estar implementado y en funcionamiento en un plazo de 6 meses desde el inicio del proyecto. </w:t>
             </w:r>
           </w:p>
           <w:p>
@@ -5993,23 +5822,7 @@
                 <w:rFonts w:cstheme="minorHAnsi"/>
                 <w:lang w:eastAsia="es-CL"/>
               </w:rPr>
-              <w:t xml:space="preserve"> Mediante el uso de arquitecturas en la nube escalables como Azure App </w:t>
-            </w:r>
-            <w:proofErr w:type="spellStart"/>
-            <w:r>
-              <w:rPr>
-                <w:rFonts w:cstheme="minorHAnsi"/>
-                <w:lang w:eastAsia="es-CL"/>
-              </w:rPr>
-              <w:t>Service</w:t>
-            </w:r>
-            <w:proofErr w:type="spellEnd"/>
-            <w:r>
-              <w:rPr>
-                <w:rFonts w:cstheme="minorHAnsi"/>
-                <w:lang w:eastAsia="es-CL"/>
-              </w:rPr>
-              <w:t xml:space="preserve"> y bases de datos distribuidas. </w:t>
+              <w:t xml:space="preserve"> Mediante el uso de arquitecturas en la nube escalables como Azure App Service y bases de datos distribuidas. </w:t>
             </w:r>
           </w:p>
           <w:p>
@@ -6163,23 +5976,7 @@
                 <w:rFonts w:cstheme="minorHAnsi"/>
                 <w:lang w:eastAsia="es-CL"/>
               </w:rPr>
-              <w:t xml:space="preserve"> El sistema registrará menos de 8.76 horas de inactividad anuales (equivalentes al 0.1% de </w:t>
-            </w:r>
-            <w:proofErr w:type="spellStart"/>
-            <w:r>
-              <w:rPr>
-                <w:rFonts w:cstheme="minorHAnsi"/>
-                <w:lang w:eastAsia="es-CL"/>
-              </w:rPr>
-              <w:t>downtime</w:t>
-            </w:r>
-            <w:proofErr w:type="spellEnd"/>
-            <w:r>
-              <w:rPr>
-                <w:rFonts w:cstheme="minorHAnsi"/>
-                <w:lang w:eastAsia="es-CL"/>
-              </w:rPr>
-              <w:t xml:space="preserve"> anual).</w:t>
+              <w:t xml:space="preserve"> El sistema registrará menos de 8.76 horas de inactividad anuales (equivalentes al 0.1% de downtime anual).</w:t>
             </w:r>
           </w:p>
           <w:p>
@@ -6208,55 +6005,7 @@
                 <w:rFonts w:cstheme="minorHAnsi"/>
                 <w:lang w:eastAsia="es-CL"/>
               </w:rPr>
-              <w:t xml:space="preserve"> Utilizaremos servicios de Azure como </w:t>
-            </w:r>
-            <w:proofErr w:type="spellStart"/>
-            <w:r>
-              <w:rPr>
-                <w:rFonts w:cstheme="minorHAnsi"/>
-                <w:lang w:eastAsia="es-CL"/>
-              </w:rPr>
-              <w:t>Availability</w:t>
-            </w:r>
-            <w:proofErr w:type="spellEnd"/>
-            <w:r>
-              <w:rPr>
-                <w:rFonts w:cstheme="minorHAnsi"/>
-                <w:lang w:eastAsia="es-CL"/>
-              </w:rPr>
-              <w:t xml:space="preserve"> Sets, Load </w:t>
-            </w:r>
-            <w:proofErr w:type="spellStart"/>
-            <w:r>
-              <w:rPr>
-                <w:rFonts w:cstheme="minorHAnsi"/>
-                <w:lang w:eastAsia="es-CL"/>
-              </w:rPr>
-              <w:t>Balancer</w:t>
-            </w:r>
-            <w:proofErr w:type="spellEnd"/>
-            <w:r>
-              <w:rPr>
-                <w:rFonts w:cstheme="minorHAnsi"/>
-                <w:lang w:eastAsia="es-CL"/>
-              </w:rPr>
-              <w:t xml:space="preserve"> y Azure Site </w:t>
-            </w:r>
-            <w:proofErr w:type="spellStart"/>
-            <w:r>
-              <w:rPr>
-                <w:rFonts w:cstheme="minorHAnsi"/>
-                <w:lang w:eastAsia="es-CL"/>
-              </w:rPr>
-              <w:t>Recovery</w:t>
-            </w:r>
-            <w:proofErr w:type="spellEnd"/>
-            <w:r>
-              <w:rPr>
-                <w:rFonts w:cstheme="minorHAnsi"/>
-                <w:lang w:eastAsia="es-CL"/>
-              </w:rPr>
-              <w:t> para implementar redundancia y recuperación automatizada.</w:t>
+              <w:t xml:space="preserve"> Utilizaremos servicios de Azure como Availability Sets, Load Balancer y Azure Site Recovery para implementar redundancia y recuperación automatizada.</w:t>
             </w:r>
           </w:p>
           <w:p>
@@ -6285,23 +6034,7 @@
                 <w:rFonts w:cstheme="minorHAnsi"/>
                 <w:lang w:eastAsia="es-CL"/>
               </w:rPr>
-              <w:t xml:space="preserve">): Critical para garantizar acceso ininterrumpido al servicio, mantener la confianza de los usuarios y cumplir con </w:t>
-            </w:r>
-            <w:proofErr w:type="spellStart"/>
-            <w:r>
-              <w:rPr>
-                <w:rFonts w:cstheme="minorHAnsi"/>
-                <w:lang w:eastAsia="es-CL"/>
-              </w:rPr>
-              <w:t>SLAs</w:t>
-            </w:r>
-            <w:proofErr w:type="spellEnd"/>
-            <w:r>
-              <w:rPr>
-                <w:rFonts w:cstheme="minorHAnsi"/>
-                <w:lang w:eastAsia="es-CL"/>
-              </w:rPr>
-              <w:t xml:space="preserve"> contractuales.</w:t>
+              <w:t>): Critical para garantizar acceso ininterrumpido al servicio, mantener la confianza de los usuarios y cumplir con SLAs contractuales.</w:t>
             </w:r>
           </w:p>
           <w:p>
@@ -6462,23 +6195,7 @@
                 <w:rFonts w:cstheme="minorHAnsi"/>
                 <w:lang w:eastAsia="es-CL"/>
               </w:rPr>
-              <w:t xml:space="preserve"> Usando estándares como AES-256, OAuth 2.0 y </w:t>
-            </w:r>
-            <w:proofErr w:type="spellStart"/>
-            <w:r>
-              <w:rPr>
-                <w:rFonts w:cstheme="minorHAnsi"/>
-                <w:lang w:eastAsia="es-CL"/>
-              </w:rPr>
-              <w:t>frameworks</w:t>
-            </w:r>
-            <w:proofErr w:type="spellEnd"/>
-            <w:r>
-              <w:rPr>
-                <w:rFonts w:cstheme="minorHAnsi"/>
-                <w:lang w:eastAsia="es-CL"/>
-              </w:rPr>
-              <w:t xml:space="preserve"> de seguridad ampliamente adoptados.</w:t>
+              <w:t xml:space="preserve"> Usando estándares como AES-256, OAuth 2.0 y frameworks de seguridad ampliamente adoptados.</w:t>
             </w:r>
           </w:p>
           <w:p>
@@ -6507,39 +6224,7 @@
                 <w:rFonts w:cstheme="minorHAnsi"/>
                 <w:lang w:eastAsia="es-CL"/>
               </w:rPr>
-              <w:t xml:space="preserve"> </w:t>
-            </w:r>
-            <w:proofErr w:type="spellStart"/>
-            <w:r>
-              <w:rPr>
-                <w:rFonts w:cstheme="minorHAnsi"/>
-                <w:lang w:eastAsia="es-CL"/>
-              </w:rPr>
-              <w:t>Essential</w:t>
-            </w:r>
-            <w:proofErr w:type="spellEnd"/>
-            <w:r>
-              <w:rPr>
-                <w:rFonts w:cstheme="minorHAnsi"/>
-                <w:lang w:eastAsia="es-CL"/>
-              </w:rPr>
-              <w:t xml:space="preserve"> para proteger datos sensibles de usuarios y cumplir con regulaciones locales (</w:t>
-            </w:r>
-            <w:proofErr w:type="spellStart"/>
-            <w:r>
-              <w:rPr>
-                <w:rFonts w:cstheme="minorHAnsi"/>
-                <w:lang w:eastAsia="es-CL"/>
-              </w:rPr>
-              <w:t>ej</w:t>
-            </w:r>
-            <w:proofErr w:type="spellEnd"/>
-            <w:r>
-              <w:rPr>
-                <w:rFonts w:cstheme="minorHAnsi"/>
-                <w:lang w:eastAsia="es-CL"/>
-              </w:rPr>
-              <w:t>: Ley 19.628 en Chile).</w:t>
+              <w:t xml:space="preserve"> Essential para proteger datos sensibles de usuarios y cumplir con regulaciones locales (ej: Ley 19.628 en Chile).</w:t>
             </w:r>
           </w:p>
           <w:p>
@@ -6854,23 +6539,7 @@
                 <w:rFonts w:cstheme="minorHAnsi"/>
                 <w:lang w:eastAsia="es-CL"/>
               </w:rPr>
-              <w:t xml:space="preserve"> Tiempo promedio para actualizaciones menores &lt;4 horas (</w:t>
-            </w:r>
-            <w:proofErr w:type="spellStart"/>
-            <w:r>
-              <w:rPr>
-                <w:rFonts w:cstheme="minorHAnsi"/>
-                <w:lang w:eastAsia="es-CL"/>
-              </w:rPr>
-              <w:t>ej</w:t>
-            </w:r>
-            <w:proofErr w:type="spellEnd"/>
-            <w:r>
-              <w:rPr>
-                <w:rFonts w:cstheme="minorHAnsi"/>
-                <w:lang w:eastAsia="es-CL"/>
-              </w:rPr>
-              <w:t>: parches, cambios simples).</w:t>
+              <w:t xml:space="preserve"> Tiempo promedio para actualizaciones menores &lt;4 horas (ej: parches, cambios simples).</w:t>
             </w:r>
           </w:p>
           <w:p>
@@ -7081,23 +6750,7 @@
                 <w:rFonts w:cstheme="minorHAnsi"/>
                 <w:lang w:eastAsia="es-CL"/>
               </w:rPr>
-              <w:t xml:space="preserve"> Mediante diseño centrado en el usuario (UX </w:t>
-            </w:r>
-            <w:proofErr w:type="spellStart"/>
-            <w:r>
-              <w:rPr>
-                <w:rFonts w:cstheme="minorHAnsi"/>
-                <w:lang w:eastAsia="es-CL"/>
-              </w:rPr>
-              <w:t>research</w:t>
-            </w:r>
-            <w:proofErr w:type="spellEnd"/>
-            <w:r>
-              <w:rPr>
-                <w:rFonts w:cstheme="minorHAnsi"/>
-                <w:lang w:eastAsia="es-CL"/>
-              </w:rPr>
-              <w:t>), prototipos iterativos y pruebas con usuarios reales.</w:t>
+              <w:t xml:space="preserve"> Mediante diseño centrado en el usuario (UX research), prototipos iterativos y pruebas con usuarios reales.</w:t>
             </w:r>
           </w:p>
           <w:p>
@@ -7231,23 +6884,7 @@
                 <w:rFonts w:cstheme="minorHAnsi"/>
                 <w:lang w:eastAsia="es-CL"/>
               </w:rPr>
-              <w:t xml:space="preserve">Medible (M): 95% de compatibilidad en pruebas con dispositivos (PC, </w:t>
-            </w:r>
-            <w:proofErr w:type="spellStart"/>
-            <w:r>
-              <w:rPr>
-                <w:rFonts w:cstheme="minorHAnsi"/>
-                <w:lang w:eastAsia="es-CL"/>
-              </w:rPr>
-              <w:t>tablets</w:t>
-            </w:r>
-            <w:proofErr w:type="spellEnd"/>
-            <w:r>
-              <w:rPr>
-                <w:rFonts w:cstheme="minorHAnsi"/>
-                <w:lang w:eastAsia="es-CL"/>
-              </w:rPr>
-              <w:t>, celulares) y navegadores principales.</w:t>
+              <w:t>Medible (M): 95% de compatibilidad en pruebas con dispositivos (PC, tablets, celulares) y navegadores principales.</w:t>
             </w:r>
           </w:p>
           <w:p>
@@ -7267,87 +6904,7 @@
                 <w:rFonts w:cstheme="minorHAnsi"/>
                 <w:lang w:eastAsia="es-CL"/>
               </w:rPr>
-              <w:t xml:space="preserve">Alcanzable (A): Usando </w:t>
-            </w:r>
-            <w:proofErr w:type="spellStart"/>
-            <w:r>
-              <w:rPr>
-                <w:rFonts w:cstheme="minorHAnsi"/>
-                <w:lang w:eastAsia="es-CL"/>
-              </w:rPr>
-              <w:t>frameworks</w:t>
-            </w:r>
-            <w:proofErr w:type="spellEnd"/>
-            <w:r>
-              <w:rPr>
-                <w:rFonts w:cstheme="minorHAnsi"/>
-                <w:lang w:eastAsia="es-CL"/>
-              </w:rPr>
-              <w:t xml:space="preserve"> responsive (</w:t>
-            </w:r>
-            <w:proofErr w:type="spellStart"/>
-            <w:r>
-              <w:rPr>
-                <w:rFonts w:cstheme="minorHAnsi"/>
-                <w:lang w:eastAsia="es-CL"/>
-              </w:rPr>
-              <w:t>ej</w:t>
-            </w:r>
-            <w:proofErr w:type="spellEnd"/>
-            <w:r>
-              <w:rPr>
-                <w:rFonts w:cstheme="minorHAnsi"/>
-                <w:lang w:eastAsia="es-CL"/>
-              </w:rPr>
-              <w:t xml:space="preserve">: Bootstrap), </w:t>
-            </w:r>
-            <w:proofErr w:type="spellStart"/>
-            <w:r>
-              <w:rPr>
-                <w:rFonts w:cstheme="minorHAnsi"/>
-                <w:lang w:eastAsia="es-CL"/>
-              </w:rPr>
-              <w:t>polyfills</w:t>
-            </w:r>
-            <w:proofErr w:type="spellEnd"/>
-            <w:r>
-              <w:rPr>
-                <w:rFonts w:cstheme="minorHAnsi"/>
-                <w:lang w:eastAsia="es-CL"/>
-              </w:rPr>
-              <w:t xml:space="preserve"> para navegadores </w:t>
-            </w:r>
-            <w:proofErr w:type="spellStart"/>
-            <w:r>
-              <w:rPr>
-                <w:rFonts w:cstheme="minorHAnsi"/>
-                <w:lang w:eastAsia="es-CL"/>
-              </w:rPr>
-              <w:t>legacy</w:t>
-            </w:r>
-            <w:proofErr w:type="spellEnd"/>
-            <w:r>
-              <w:rPr>
-                <w:rFonts w:cstheme="minorHAnsi"/>
-                <w:lang w:eastAsia="es-CL"/>
-              </w:rPr>
-              <w:t xml:space="preserve"> y pruebas automatizadas con herramientas como </w:t>
-            </w:r>
-            <w:proofErr w:type="spellStart"/>
-            <w:r>
-              <w:rPr>
-                <w:rFonts w:cstheme="minorHAnsi"/>
-                <w:lang w:eastAsia="es-CL"/>
-              </w:rPr>
-              <w:t>BrowserStack</w:t>
-            </w:r>
-            <w:proofErr w:type="spellEnd"/>
-            <w:r>
-              <w:rPr>
-                <w:rFonts w:cstheme="minorHAnsi"/>
-                <w:lang w:eastAsia="es-CL"/>
-              </w:rPr>
-              <w:t>.</w:t>
+              <w:t>Alcanzable (A): Usando frameworks responsive (ej: Bootstrap), polyfills para navegadores legacy y pruebas automatizadas con herramientas como BrowserStack.</w:t>
             </w:r>
           </w:p>
           <w:p>
@@ -7470,23 +7027,7 @@
                 <w:rFonts w:cstheme="minorHAnsi"/>
                 <w:lang w:eastAsia="es-CL"/>
               </w:rPr>
-              <w:t xml:space="preserve"> Garantizar que el SaaS cumpla integralmente con la Ley de Copropiedad 21.442 de Chile y regulaciones complementarias (</w:t>
-            </w:r>
-            <w:proofErr w:type="spellStart"/>
-            <w:r>
-              <w:rPr>
-                <w:rFonts w:cstheme="minorHAnsi"/>
-                <w:lang w:eastAsia="es-CL"/>
-              </w:rPr>
-              <w:t>ej</w:t>
-            </w:r>
-            <w:proofErr w:type="spellEnd"/>
-            <w:r>
-              <w:rPr>
-                <w:rFonts w:cstheme="minorHAnsi"/>
-                <w:lang w:eastAsia="es-CL"/>
-              </w:rPr>
-              <w:t>: Ley 19.628 de Protección de Datos).</w:t>
+              <w:t xml:space="preserve"> Garantizar que el SaaS cumpla integralmente con la Ley de Copropiedad 21.442 de Chile y regulaciones complementarias (ej: Ley 19.628 de Protección de Datos).</w:t>
             </w:r>
           </w:p>
           <w:p>
@@ -7544,23 +7085,7 @@
                 <w:rFonts w:cstheme="minorHAnsi"/>
                 <w:lang w:eastAsia="es-CL"/>
               </w:rPr>
-              <w:t xml:space="preserve"> Mediante asesoría legal especializada, implementación de funcionalidades ad-hoc (</w:t>
-            </w:r>
-            <w:proofErr w:type="spellStart"/>
-            <w:r>
-              <w:rPr>
-                <w:rFonts w:cstheme="minorHAnsi"/>
-                <w:lang w:eastAsia="es-CL"/>
-              </w:rPr>
-              <w:t>ej</w:t>
-            </w:r>
-            <w:proofErr w:type="spellEnd"/>
-            <w:r>
-              <w:rPr>
-                <w:rFonts w:cstheme="minorHAnsi"/>
-                <w:lang w:eastAsia="es-CL"/>
-              </w:rPr>
-              <w:t>: transparencia en gastos, quórum digital) y revisiones iterativas.</w:t>
+              <w:t xml:space="preserve"> Mediante asesoría legal especializada, implementación de funcionalidades ad-hoc (ej: transparencia en gastos, quórum digital) y revisiones iterativas.</w:t>
             </w:r>
           </w:p>
           <w:p>
@@ -10414,7 +9939,7 @@
               <w:bottom w:val="single" w:sz="4" w:space="0" w:color="BFBFBF" w:themeColor="background1" w:themeShade="BF"/>
               <w:right w:val="single" w:sz="4" w:space="0" w:color="BFBFBF" w:themeColor="background1" w:themeShade="BF"/>
             </w:tcBorders>
-            <w:shd w:val="clear" w:color="auto" w:fill="FFFFFF" w:themeFill="background1"/>
+            <w:shd w:val="clear" w:color="auto" w:fill="B4C6E7" w:themeFill="accent1" w:themeFillTint="66"/>
             <w:vAlign w:val="center"/>
           </w:tcPr>
           <w:p>
@@ -11039,7 +10564,7 @@
               <w:bottom w:val="single" w:sz="4" w:space="0" w:color="BFBFBF" w:themeColor="background1" w:themeShade="BF"/>
               <w:right w:val="single" w:sz="4" w:space="0" w:color="BFBFBF" w:themeColor="background1" w:themeShade="BF"/>
             </w:tcBorders>
-            <w:shd w:val="clear" w:color="auto" w:fill="B4C6E7" w:themeFill="accent1" w:themeFillTint="66"/>
+            <w:shd w:val="clear" w:color="auto" w:fill="FFFFFF" w:themeFill="background1"/>
             <w:vAlign w:val="center"/>
           </w:tcPr>
           <w:p>
@@ -13567,7 +13092,15 @@
           <w:sz w:val="24"/>
           <w:szCs w:val="24"/>
         </w:rPr>
-        <w:t>25</w:t>
+        <w:t>2</w:t>
+      </w:r>
+      <w:r>
+        <w:rPr>
+          <w:b/>
+          <w:sz w:val="24"/>
+          <w:szCs w:val="24"/>
+        </w:rPr>
+        <w:t>2</w:t>
       </w:r>
       <w:r>
         <w:rPr>
@@ -13599,7 +13132,7 @@
           <w:sz w:val="24"/>
           <w:szCs w:val="24"/>
         </w:rPr>
-        <w:t>29</w:t>
+        <w:t>05</w:t>
       </w:r>
       <w:r>
         <w:rPr>
@@ -13615,7 +13148,7 @@
           <w:sz w:val="24"/>
           <w:szCs w:val="24"/>
         </w:rPr>
-        <w:t>8</w:t>
+        <w:t>9</w:t>
       </w:r>
     </w:p>
     <w:p>
@@ -13642,7 +13175,15 @@
           <w:sz w:val="24"/>
           <w:szCs w:val="24"/>
         </w:rPr>
-        <w:t>01</w:t>
+        <w:t>0</w:t>
+      </w:r>
+      <w:r>
+        <w:rPr>
+          <w:b/>
+          <w:sz w:val="24"/>
+          <w:szCs w:val="24"/>
+        </w:rPr>
+        <w:t>8</w:t>
       </w:r>
       <w:r>
         <w:rPr>
@@ -13682,7 +13223,7 @@
           <w:sz w:val="24"/>
           <w:szCs w:val="24"/>
         </w:rPr>
-        <w:t>21</w:t>
+        <w:t>30</w:t>
       </w:r>
       <w:r>
         <w:rPr>
@@ -13725,15 +13266,7 @@
           <w:sz w:val="24"/>
           <w:szCs w:val="24"/>
         </w:rPr>
-        <w:t>2</w:t>
-      </w:r>
-      <w:r>
-        <w:rPr>
-          <w:b/>
-          <w:sz w:val="24"/>
-          <w:szCs w:val="24"/>
-        </w:rPr>
-        <w:t>4</w:t>
+        <w:t>01</w:t>
       </w:r>
       <w:r>
         <w:rPr>
@@ -13749,7 +13282,15 @@
           <w:sz w:val="24"/>
           <w:szCs w:val="24"/>
         </w:rPr>
-        <w:t>11</w:t>
+        <w:t>1</w:t>
+      </w:r>
+      <w:r>
+        <w:rPr>
+          <w:b/>
+          <w:sz w:val="24"/>
+          <w:szCs w:val="24"/>
+        </w:rPr>
+        <w:t>2</w:t>
       </w:r>
       <w:r>
         <w:rPr>
@@ -13765,31 +13306,7 @@
           <w:sz w:val="24"/>
           <w:szCs w:val="24"/>
         </w:rPr>
-        <w:t>0</w:t>
-      </w:r>
-      <w:r>
-        <w:rPr>
-          <w:b/>
-          <w:sz w:val="24"/>
-          <w:szCs w:val="24"/>
-        </w:rPr>
-        <w:t>5</w:t>
-      </w:r>
-      <w:r>
-        <w:rPr>
-          <w:b/>
-          <w:sz w:val="24"/>
-          <w:szCs w:val="24"/>
-        </w:rPr>
-        <w:t>/</w:t>
-      </w:r>
-      <w:r>
-        <w:rPr>
-          <w:b/>
-          <w:sz w:val="24"/>
-          <w:szCs w:val="24"/>
-        </w:rPr>
-        <w:t>12</w:t>
+        <w:t xml:space="preserve"> 12/12</w:t>
       </w:r>
     </w:p>
     <w:bookmarkEnd w:id="0"/>
@@ -14876,21 +14393,7 @@
               <w:rPr>
                 <w:lang w:val="es-ES"/>
               </w:rPr>
-              <w:t xml:space="preserve">12.  Redacta el </w:t>
-            </w:r>
-            <w:proofErr w:type="spellStart"/>
-            <w:r>
-              <w:rPr>
-                <w:lang w:val="es-ES"/>
-              </w:rPr>
-              <w:t>abstract</w:t>
-            </w:r>
-            <w:proofErr w:type="spellEnd"/>
-            <w:r>
-              <w:rPr>
-                <w:lang w:val="es-ES"/>
-              </w:rPr>
-              <w:t>, las conclusiones y la reflexión en inglés con ideas completas que se conectan en secuencia lógica, utilizando estructuras gramaticales y vocabulario en forma correcta y pertinente al tema a un nivel intermedio alto.</w:t>
+              <w:t>12.  Redacta el abstract, las conclusiones y la reflexión en inglés con ideas completas que se conectan en secuencia lógica, utilizando estructuras gramaticales y vocabulario en forma correcta y pertinente al tema a un nivel intermedio alto.</w:t>
             </w:r>
           </w:p>
           <w:p>
@@ -20910,12 +20413,9 @@
 </file>
 
 <file path=customXml/item1.xml><?xml version="1.0" encoding="utf-8"?>
-<?mso-contentType ?>
-<FormTemplates xmlns="http://schemas.microsoft.com/sharepoint/v3/contenttype/forms">
-  <Display>DocumentLibraryForm</Display>
-  <Edit>DocumentLibraryForm</Edit>
-  <New>DocumentLibraryForm</New>
-</FormTemplates>
+<p:properties xmlns:p="http://schemas.microsoft.com/office/2006/metadata/properties" xmlns:xsi="http://www.w3.org/2001/XMLSchema-instance" xmlns:pc="http://schemas.microsoft.com/office/infopath/2007/PartnerControls">
+  <documentManagement/>
+</p:properties>
 </file>
 
 <file path=customXml/item2.xml><?xml version="1.0" encoding="utf-8"?>
@@ -21051,15 +20551,19 @@
 </file>
 
 <file path=customXml/item3.xml><?xml version="1.0" encoding="utf-8"?>
-<p:properties xmlns:p="http://schemas.microsoft.com/office/2006/metadata/properties" xmlns:xsi="http://www.w3.org/2001/XMLSchema-instance" xmlns:pc="http://schemas.microsoft.com/office/infopath/2007/PartnerControls">
-  <documentManagement/>
-</p:properties>
+<?mso-contentType ?>
+<FormTemplates xmlns="http://schemas.microsoft.com/sharepoint/v3/contenttype/forms">
+  <Display>DocumentLibraryForm</Display>
+  <Edit>DocumentLibraryForm</Edit>
+  <New>DocumentLibraryForm</New>
+</FormTemplates>
 </file>
 
 <file path=customXml/itemProps1.xml><?xml version="1.0" encoding="utf-8"?>
-<ds:datastoreItem xmlns:ds="http://schemas.openxmlformats.org/officeDocument/2006/customXml" ds:itemID="{F3E3E2F7-59E7-4722-B872-D023DC9D1CC1}">
+<ds:datastoreItem xmlns:ds="http://schemas.openxmlformats.org/officeDocument/2006/customXml" ds:itemID="{38174882-579A-45DC-A704-C035A9357F73}">
   <ds:schemaRefs>
-    <ds:schemaRef ds:uri="http://schemas.microsoft.com/sharepoint/v3/contenttype/forms"/>
+    <ds:schemaRef ds:uri="http://schemas.microsoft.com/office/2006/metadata/properties"/>
+    <ds:schemaRef ds:uri="http://schemas.microsoft.com/office/infopath/2007/PartnerControls"/>
   </ds:schemaRefs>
 </ds:datastoreItem>
 </file>
@@ -21083,10 +20587,9 @@
 </file>
 
 <file path=customXml/itemProps3.xml><?xml version="1.0" encoding="utf-8"?>
-<ds:datastoreItem xmlns:ds="http://schemas.openxmlformats.org/officeDocument/2006/customXml" ds:itemID="{38174882-579A-45DC-A704-C035A9357F73}">
+<ds:datastoreItem xmlns:ds="http://schemas.openxmlformats.org/officeDocument/2006/customXml" ds:itemID="{F3E3E2F7-59E7-4722-B872-D023DC9D1CC1}">
   <ds:schemaRefs>
-    <ds:schemaRef ds:uri="http://schemas.microsoft.com/office/2006/metadata/properties"/>
-    <ds:schemaRef ds:uri="http://schemas.microsoft.com/office/infopath/2007/PartnerControls"/>
+    <ds:schemaRef ds:uri="http://schemas.microsoft.com/sharepoint/v3/contenttype/forms"/>
   </ds:schemaRefs>
 </ds:datastoreItem>
 </file>
</xml_diff>